<commit_message>
fix(templates): correct signature placement in patient intake/consent form
Page 1: patient signature now renders in the 'Patient Signature' column instead of next to the assigned therapist. Page 2 (consent): patient + front-office signatures stack on their own lines instead of crowding one line and spilling off the page. Template-only change (docxtemplater {{%...}} placeholders); no schema/code change.

Co-Authored-By: Claude Opus 4.8 (1M context) <noreply@anthropic.com>
</commit_message>
<xml_diff>
--- a/templates/COMMON_PATIENT_INTAKE_FORM.docx
+++ b/templates/COMMON_PATIENT_INTAKE_FORM.docx
@@ -882,13 +882,6 @@
               </w:rPr>
               <w:t xml:space="preserve">     Assigned to:  {{assignedTo}}</w:t>
             </w:r>
-            <w:r>
-              <w:rPr>
-                <w:rFonts w:ascii="Times New Roman" w:hAnsi="Times New Roman" w:cs="Times New Roman"/>
-                <w:b/>
-              </w:rPr>
-              <w:t>{{%patientSignature}}</w:t>
-            </w:r>
           </w:p>
         </w:tc>
       </w:tr>
@@ -914,7 +907,7 @@
                 <w:rFonts w:ascii="Times New Roman" w:hAnsi="Times New Roman" w:cs="Times New Roman"/>
                 <w:b/>
               </w:rPr>
-              <w:t>____________________________</w:t>
+              <w:t>{{%patientSignature}}</w:t>
             </w:r>
           </w:p>
         </w:tc>
@@ -1648,7 +1641,7 @@
           <w:rFonts w:ascii="Times New Roman" w:hAnsi="Times New Roman" w:cs="Times New Roman"/>
           <w:b/>
         </w:rPr>
-        <w:tab/>
+        <w:br/>
         <w:t>{{%frontOffice.signature}}</w:t>
       </w:r>
       <w:r>

</xml_diff>